<commit_message>
Publish aligned teaching resources
</commit_message>
<xml_diff>
--- a/resources/teacher/Food-for-Purpose-50-Period-Teaching-Program-v2.0-Network-Benchmark.docx
+++ b/resources/teacher/Food-for-Purpose-50-Period-Teaching-Program-v2.0-Network-Benchmark.docx
@@ -110,7 +110,7 @@
                 <w:color w:val="FFFFFF"/>
                 <w:sz w:val="19"/>
               </w:rPr>
-              <w:t>School-developed 50-hour Stage 4 introductory elective</w:t>
+              <w:t>50-period introductory unit within a 100-hour elective</w:t>
             </w:r>
           </w:p>
         </w:tc>
@@ -634,7 +634,7 @@
                 <w:color w:val="174829"/>
                 <w:sz w:val="19"/>
               </w:rPr>
-              <w:t>This is not the NESA 100-hour or 200-hour elective</w:t>
+              <w:t>Pair with sufficient additional study to complete 100 hours</w:t>
             </w:r>
           </w:p>
         </w:tc>
@@ -675,7 +675,7 @@
                 <w:color w:val="174829"/>
                 <w:sz w:val="19"/>
               </w:rPr>
-              <w:t>FT5-IET-01 is introduced through the food-systems module. This 50-hour introductory elective does not claim the breadth or formal achievement of a NESA 100-hour course.</w:t>
+              <w:t>This 50-period unit contributes to, but does not complete, a 100-hour Food Technology elective. FT5-IET-01 is introduced through the food-systems module; additional study must complete the school's named elective.</w:t>
             </w:r>
           </w:p>
         </w:tc>
@@ -693,7 +693,7 @@
           <w:color w:val="174829"/>
           <w:sz w:val="23"/>
         </w:rPr>
-        <w:t>Official Stage 4 adjustment and Stage 5 outcomes</w:t>
+        <w:t>Official Stage 5 outcomes</w:t>
       </w:r>
     </w:p>
     <w:tbl>
@@ -848,7 +848,7 @@
                 <w:color w:val="243024"/>
                 <w:sz w:val="19"/>
               </w:rPr>
-              <w:t>FT4-ADJ-01</w:t>
+              <w:t>FT5-SAF-01</w:t>
             </w:r>
           </w:p>
         </w:tc>
@@ -876,7 +876,7 @@
                 <w:color w:val="243024"/>
                 <w:sz w:val="19"/>
               </w:rPr>
-              <w:t>in Stage 4, teachers may adjust the Stage 5 outcomes as appropriate to the needs of students in Years 7 and 8</w:t>
+              <w:t>applies safe work and management practices through food design and production processes</w:t>
             </w:r>
           </w:p>
         </w:tc>
@@ -904,7 +904,7 @@
                 <w:color w:val="243024"/>
                 <w:sz w:val="19"/>
               </w:rPr>
-              <w:t>FT5-USE-01</w:t>
+              <w:t>FT5-IET-01</w:t>
             </w:r>
           </w:p>
         </w:tc>
@@ -932,7 +932,7 @@
                 <w:color w:val="243024"/>
                 <w:sz w:val="19"/>
               </w:rPr>
-              <w:t>selects and applies ingredients, techniques and equipment in food design and production contexts</w:t>
+              <w:t>explains industry practices and emerging technologies used in food design and production</w:t>
             </w:r>
           </w:p>
         </w:tc>
@@ -962,7 +962,7 @@
                 <w:color w:val="243024"/>
                 <w:sz w:val="19"/>
               </w:rPr>
-              <w:t>FT5-SAF-01</w:t>
+              <w:t>FT5-COM-01</w:t>
             </w:r>
           </w:p>
         </w:tc>
@@ -990,7 +990,7 @@
                 <w:color w:val="243024"/>
                 <w:sz w:val="19"/>
               </w:rPr>
-              <w:t>applies safe work and management practices through food design and production processes</w:t>
+              <w:t>communicates ideas, concepts and solutions in food design and production contexts</w:t>
             </w:r>
           </w:p>
         </w:tc>
@@ -1018,7 +1018,7 @@
                 <w:color w:val="243024"/>
                 <w:sz w:val="19"/>
               </w:rPr>
-              <w:t>FT5-IET-01</w:t>
+              <w:t>FT5-NSA-01</w:t>
             </w:r>
           </w:p>
         </w:tc>
@@ -1046,7 +1046,7 @@
                 <w:color w:val="243024"/>
                 <w:sz w:val="19"/>
               </w:rPr>
-              <w:t>explains industry practices and emerging technologies used in food design and production</w:t>
+              <w:t>assesses how nutrition, food selection and availability influence individuals and communities</w:t>
             </w:r>
           </w:p>
         </w:tc>
@@ -1076,7 +1076,7 @@
                 <w:color w:val="243024"/>
                 <w:sz w:val="19"/>
               </w:rPr>
-              <w:t>FT5-COM-01</w:t>
+              <w:t>FT5-FPP-01</w:t>
             </w:r>
           </w:p>
         </w:tc>
@@ -1104,7 +1104,7 @@
                 <w:color w:val="243024"/>
                 <w:sz w:val="19"/>
               </w:rPr>
-              <w:t>communicates ideas, concepts and solutions in food design and production contexts</w:t>
+              <w:t>selects and justifies the use of food preparation and presentation practices</w:t>
             </w:r>
           </w:p>
         </w:tc>
@@ -1132,7 +1132,7 @@
                 <w:color w:val="243024"/>
                 <w:sz w:val="19"/>
               </w:rPr>
-              <w:t>FT5-NSA-01</w:t>
+              <w:t>FT5-ENV-01</w:t>
             </w:r>
           </w:p>
         </w:tc>
@@ -1160,7 +1160,7 @@
                 <w:color w:val="243024"/>
                 <w:sz w:val="19"/>
               </w:rPr>
-              <w:t>assesses how nutrition, food selection and availability influence individuals and communities</w:t>
+              <w:t>analyses relationships between food production systems, sustainability and society</w:t>
             </w:r>
           </w:p>
         </w:tc>
@@ -1190,7 +1190,7 @@
                 <w:color w:val="243024"/>
                 <w:sz w:val="19"/>
               </w:rPr>
-              <w:t>FT5-FPP-01</w:t>
+              <w:t>FT5-USE-01</w:t>
             </w:r>
           </w:p>
         </w:tc>
@@ -1218,7 +1218,7 @@
                 <w:color w:val="243024"/>
                 <w:sz w:val="19"/>
               </w:rPr>
-              <w:t>selects and justifies the use of food preparation and presentation practices</w:t>
+              <w:t>selects and applies ingredients, techniques and equipment in food design and production contexts</w:t>
             </w:r>
           </w:p>
         </w:tc>
@@ -1246,7 +1246,6 @@
                 <w:color w:val="243024"/>
                 <w:sz w:val="19"/>
               </w:rPr>
-              <w:t>FT5-ENV-01</w:t>
             </w:r>
           </w:p>
         </w:tc>
@@ -1274,7 +1273,6 @@
                 <w:color w:val="243024"/>
                 <w:sz w:val="19"/>
               </w:rPr>
-              <w:t>analyses relationships between food production systems, sustainability and society</w:t>
             </w:r>
           </w:p>
         </w:tc>
@@ -2522,7 +2520,7 @@
                 <w:color w:val="FFFFFF"/>
                 <w:sz w:val="19"/>
               </w:rPr>
-              <w:t>Syllabus alignment</w:t>
+              <w:t>Syllabus content</w:t>
             </w:r>
           </w:p>
         </w:tc>
@@ -2550,7 +2548,7 @@
                 <w:color w:val="FFFFFF"/>
                 <w:sz w:val="19"/>
               </w:rPr>
-              <w:t>What the teacher checks</w:t>
+              <w:t>Evidence / outcomes</w:t>
             </w:r>
           </w:p>
         </w:tc>
@@ -4622,7 +4620,7 @@
                 <w:color w:val="FFFFFF"/>
                 <w:sz w:val="19"/>
               </w:rPr>
-              <w:t>Syllabus alignment</w:t>
+              <w:t>Syllabus content</w:t>
             </w:r>
           </w:p>
         </w:tc>
@@ -4650,7 +4648,7 @@
                 <w:color w:val="FFFFFF"/>
                 <w:sz w:val="19"/>
               </w:rPr>
-              <w:t>What the teacher checks</w:t>
+              <w:t>Evidence / outcomes</w:t>
             </w:r>
           </w:p>
         </w:tc>
@@ -6722,7 +6720,7 @@
                 <w:color w:val="FFFFFF"/>
                 <w:sz w:val="19"/>
               </w:rPr>
-              <w:t>Syllabus alignment</w:t>
+              <w:t>Syllabus content</w:t>
             </w:r>
           </w:p>
         </w:tc>
@@ -6750,7 +6748,7 @@
                 <w:color w:val="FFFFFF"/>
                 <w:sz w:val="19"/>
               </w:rPr>
-              <w:t>What the teacher checks</w:t>
+              <w:t>Evidence / outcomes</w:t>
             </w:r>
           </w:p>
         </w:tc>
@@ -8822,7 +8820,7 @@
                 <w:color w:val="FFFFFF"/>
                 <w:sz w:val="19"/>
               </w:rPr>
-              <w:t>Syllabus alignment</w:t>
+              <w:t>Syllabus content</w:t>
             </w:r>
           </w:p>
         </w:tc>
@@ -8850,7 +8848,7 @@
                 <w:color w:val="FFFFFF"/>
                 <w:sz w:val="19"/>
               </w:rPr>
-              <w:t>What the teacher checks</w:t>
+              <w:t>Evidence / outcomes</w:t>
             </w:r>
           </w:p>
         </w:tc>
@@ -10922,7 +10920,7 @@
                 <w:color w:val="FFFFFF"/>
                 <w:sz w:val="19"/>
               </w:rPr>
-              <w:t>Syllabus alignment</w:t>
+              <w:t>Syllabus content</w:t>
             </w:r>
           </w:p>
         </w:tc>
@@ -10950,7 +10948,7 @@
                 <w:color w:val="FFFFFF"/>
                 <w:sz w:val="19"/>
               </w:rPr>
-              <w:t>What the teacher checks</w:t>
+              <w:t>Evidence / outcomes</w:t>
             </w:r>
           </w:p>
         </w:tc>

</xml_diff>